<commit_message>
docs: remove em dashes from strategy doc and add one-pager
- Fix 3 remaining em dashes in build-strategy-doc.cjs and regenerate
- Add build-onepager.cjs generating a 2-page shareable summary
- One-pager covers: problem, approach, 11 recommendations by category, design principles, roadmap, and success metrics

Co-Authored-By: Claude Sonnet 4.6 <noreply@anthropic.com>
</commit_message>
<xml_diff>
--- a/docs/2026-EX-Maturity-Strategy-updated.docx
+++ b/docs/2026-EX-Maturity-Strategy-updated.docx
@@ -136,7 +136,7 @@
           <w:sz w:val="20"/>
           <w:szCs w:val="20"/>
         </w:rPr>
-        <w:t xml:space="preserve">A dedicated tab in every EX project that surfaces personalized, outcome-focused recommendations based on where each customer currently is in their program. This is the awareness layer — it tells customers what to do next and why, without exposing internal scores or maturity levels.</w:t>
+        <w:t xml:space="preserve">A dedicated tab in every EX project that surfaces personalized, outcome-focused recommendations based on where each customer currently is in their program. This is the awareness layer: it tells customers what to do next and why, without exposing internal scores or maturity levels.</w:t>
       </w:r>
     </w:p>
     <w:p>
@@ -166,7 +166,7 @@
           <w:sz w:val="20"/>
           <w:szCs w:val="20"/>
         </w:rPr>
-        <w:t xml:space="preserve">A set of guided configuration flows — one per recommended action — that walk customers through setup step by step. This is the configuration layer. These extend the pattern established by the Guided Engagement Program (GEP) to post-launch maturity actions.</w:t>
+        <w:t xml:space="preserve">A set of guided configuration flows, one per recommended action, that walk customers through setup step by step. This is the configuration layer. These extend the pattern established by the Guided Engagement Program (GEP) to post-launch maturity actions.</w:t>
       </w:r>
     </w:p>
     <w:p>
@@ -224,7 +224,7 @@
           <w:sz w:val="20"/>
           <w:szCs w:val="20"/>
         </w:rPr>
-        <w:t xml:space="preserve">The 2026 PLG vision positions Qualtrics to evolve beyond a toolkit into a proactive, guided, intelligent experience. For EX specifically, this means enabling admins to self-serve through in-product guidance and agentic assistance — reducing services reliance while increasing program maturity and retention.</w:t>
+        <w:t xml:space="preserve">The 2026 PLG vision positions Qualtrics to evolve beyond a toolkit into a proactive, guided, intelligent experience. For EX specifically, this means enabling admins to self-serve through in-product guidance and agentic assistance, reducing services reliance while increasing program maturity and retention.</w:t>
       </w:r>
     </w:p>
     <w:p>
@@ -260,7 +260,7 @@
           <w:sz w:val="20"/>
           <w:szCs w:val="20"/>
         </w:rPr>
-        <w:t xml:space="preserve">Previous maturity-focused efforts — tooltips, Pendo guides, feature announcements — addressed only the awareness gap. UXR findings indicate that awareness alone is insufficient. Low-maturity customers face two distinct barriers:</w:t>
+        <w:t xml:space="preserve">Previous maturity-focused efforts (tooltips, Pendo guides, feature announcements) addressed only the awareness gap. UXR findings indicate that awareness alone is insufficient. Low-maturity customers face two distinct barriers:</w:t>
       </w:r>
     </w:p>
     <w:p>
@@ -325,7 +325,7 @@
           <w:sz w:val="20"/>
           <w:szCs w:val="20"/>
         </w:rPr>
-        <w:t xml:space="preserve">Even when users are aware of a feature, they perceive setup as too complex or time-consuming, leading to abandonment or workarounds — most commonly, exporting to Excel for analysis that could be done in-platform.</w:t>
+        <w:t xml:space="preserve">Even when users are aware of a feature, they perceive setup as too complex or time-consuming, leading to abandonment or workarounds, most commonly exporting to Excel for analysis that could be done in-platform.</w:t>
       </w:r>
     </w:p>
     <w:p>
@@ -764,7 +764,7 @@
                 <w:sz w:val="20"/>
                 <w:szCs w:val="20"/>
               </w:rPr>
-              <w:t xml:space="preserve">Complete configuration through a structured flow — no manual navigation required</w:t>
+              <w:t xml:space="preserve">Complete configuration through a structured flow, no manual navigation required</w:t>
             </w:r>
           </w:p>
         </w:tc>
@@ -960,7 +960,7 @@
                 <w:sz w:val="20"/>
                 <w:szCs w:val="20"/>
               </w:rPr>
-              <w:t xml:space="preserve">To be built — one experience per recommendation</w:t>
+              <w:t xml:space="preserve">To be built, one per recommendation</w:t>
             </w:r>
           </w:p>
         </w:tc>
@@ -1055,7 +1055,7 @@
                 <w:sz w:val="20"/>
                 <w:szCs w:val="20"/>
               </w:rPr>
-              <w:t xml:space="preserve">"When possible, we will do the work for the user rather than making it easier for the user to do on their own." Guided Experiences embody this principle — not tooltips that explain how to configure, but flows that complete configuration with the user.</w:t>
+              <w:t xml:space="preserve">"When possible, we will do the work for the user rather than making it easier for the user to do on their own." Guided Experiences embody this principle: not tooltips that explain how to configure, but flows that complete configuration with the user.</w:t>
             </w:r>
           </w:p>
         </w:tc>
@@ -1121,7 +1121,7 @@
           <w:sz w:val="20"/>
           <w:szCs w:val="20"/>
         </w:rPr>
-        <w:t xml:space="preserve">EX project admins report friction primarily with analysis and reporting configuration — driven by perceived platform complexity, not lack of awareness.</w:t>
+        <w:t xml:space="preserve">EX project admins report friction primarily with analysis and reporting configuration, driven by perceived platform complexity, not lack of awareness.</w:t>
       </w:r>
     </w:p>
     <w:p>
@@ -1197,7 +1197,7 @@
           <w:sz w:val="20"/>
           <w:szCs w:val="20"/>
         </w:rPr>
-        <w:t xml:space="preserve">When users do begin configuring advanced features, they frequently abandon partway through — not because they don't want the feature, but because the setup path is unclear.</w:t>
+        <w:t xml:space="preserve">When users do begin configuring advanced features, they frequently abandon partway through. Not because they don't want the feature, but because the setup path is unclear.</w:t>
       </w:r>
     </w:p>
     <w:p>
@@ -1236,7 +1236,7 @@
           <w:sz w:val="20"/>
           <w:szCs w:val="20"/>
         </w:rPr>
-        <w:t xml:space="preserve">The Program Growth tab is a dedicated tab within each EX project. It surfaces outcome-focused recommendations personalized to the customer's current account state — what they're collecting, how they're analyzing it, and what they're doing with the results. The tab is driven by the internal L1–L4 EX maturity framework, but customers never see levels or scores. They see recommendations framed around the business outcome, not the feature.</w:t>
+        <w:t xml:space="preserve">The Program Growth tab is a dedicated tab within each EX project. It surfaces outcome-focused recommendations personalized to the customer's current account state: what they're collecting, how they're analyzing it, and what they're doing with the results. The tab is driven by the internal L1–L4 EX maturity framework, but customers never see levels or scores. They see recommendations framed around the business outcome, not the feature.</w:t>
       </w:r>
     </w:p>
     <w:p>
@@ -1288,7 +1288,7 @@
           <w:sz w:val="20"/>
           <w:szCs w:val="20"/>
         </w:rPr>
-        <w:t xml:space="preserve">Recommendations lead with the business goal, not the product feature. "Listen to employees more than once a year" — not "Set up a pulse survey."</w:t>
+        <w:t xml:space="preserve">Recommendations lead with the business goal, not the product feature. "Listen to employees more than once a year" rather than "Set up a pulse survey."</w:t>
       </w:r>
     </w:p>
     <w:p>
@@ -1318,7 +1318,7 @@
           <w:sz w:val="20"/>
           <w:szCs w:val="20"/>
         </w:rPr>
-        <w:t xml:space="preserve">Each recommendation references specific data from the customer's account. "You have 200 open-ended responses that aren't being analyzed yet" — not generic copy.</w:t>
+        <w:t xml:space="preserve">Each recommendation references specific data from the customer's account. "You have 200 open-ended responses that aren't being analyzed yet", not generic copy.</w:t>
       </w:r>
     </w:p>
     <w:p>
@@ -1348,7 +1348,7 @@
           <w:sz w:val="20"/>
           <w:szCs w:val="20"/>
         </w:rPr>
-        <w:t xml:space="preserve">Where multiple features can achieve the same outcome, the customer is shown option cards with context on each — so they can choose the path that fits their program, rather than being pushed to a single feature.</w:t>
+        <w:t xml:space="preserve">Where multiple features can achieve the same outcome, the customer is shown option cards with context on each, so they can choose the path that fits their program, rather than being pushed to a single feature.</w:t>
       </w:r>
     </w:p>
     <w:p>
@@ -1907,7 +1907,7 @@
           <w:sz w:val="20"/>
           <w:szCs w:val="20"/>
         </w:rPr>
-        <w:t xml:space="preserve">The Program Growth tab is always accessible as a named tab in the project navigation. It does not require the customer to seek it out — the tab is present and labeled alongside Overview, Survey, Dashboards, and other standard tabs.</w:t>
+        <w:t xml:space="preserve">The Program Growth tab is always accessible as a named tab in the project navigation. It does not require the customer to seek it out. The tab is present and labeled alongside Overview, Survey, Dashboards, and other standard tabs.</w:t>
       </w:r>
     </w:p>
     <w:p>
@@ -1926,7 +1926,7 @@
           <w:sz w:val="20"/>
           <w:szCs w:val="20"/>
         </w:rPr>
-        <w:t xml:space="preserve">Additionally, the existing XM Advisor nudge pattern (a contextual banner that surfaces on relevant pages) can be used to actively direct customers to the Program Growth tab at key moments — for example, on first dashboard view after survey close, or when a threshold of unanalyzed responses is detected. This gives customers a push without making the recommendations intrusive or unprompted on every page view.</w:t>
+        <w:t xml:space="preserve">Additionally, the existing XM Advisor nudge pattern (a contextual banner that surfaces on relevant pages) can be used to actively direct customers to the Program Growth tab at key moments, such as on first dashboard view after survey close, or when a threshold of unanalyzed responses is detected. This gives customers a push without making the recommendations intrusive or unprompted on every page view.</w:t>
       </w:r>
     </w:p>
     <w:p>
@@ -1962,7 +1962,7 @@
           <w:sz w:val="20"/>
           <w:szCs w:val="20"/>
         </w:rPr>
-        <w:t xml:space="preserve">The recommendations are driven by a 4-level EX maturity model evaluated against real account telemetry. The model assesses signals across Listen, Understand, and Act dimensions — response counts, feature usage, dashboard views, workflow activity, and more — and generates a prioritized set of growth actions for each account.</w:t>
+        <w:t xml:space="preserve">The recommendations are driven by a 4-level EX maturity model evaluated against real account telemetry. The model assesses signals across Listen, Understand, and Act dimensions: response counts, feature usage, dashboard views, workflow activity, and more, generating a prioritized set of growth actions for each account.</w:t>
       </w:r>
     </w:p>
     <w:p>
@@ -2020,7 +2020,7 @@
           <w:sz w:val="20"/>
           <w:szCs w:val="20"/>
         </w:rPr>
-        <w:t xml:space="preserve">The Program Growth tab tells customers what to do. Guided Experiences help them actually do it. Each recommendation in the Program Growth tab will have a corresponding guided experience — a structured, step-by-step configuration flow that reduces the complexity of setup and, where possible, does the work on the customer's behalf.</w:t>
+        <w:t xml:space="preserve">The Program Growth tab tells customers what to do. Guided Experiences help them actually do it. Each recommendation in the Program Growth tab will have a corresponding guided experience: a structured, step-by-step configuration flow that reduces the complexity of setup and, where possible, does the work on the customer's behalf.</w:t>
       </w:r>
     </w:p>
     <w:p>
@@ -3295,7 +3295,7 @@
           <w:sz w:val="20"/>
           <w:szCs w:val="20"/>
         </w:rPr>
-        <w:t xml:space="preserve">Each recommendation in the Program Growth tab has a CTA button that launches the corresponding Guided Experience directly. Customers do not need to navigate to the feature independently — the tab serves as both the discovery surface and the entry point. This closes the loop between awareness and action within a single interaction.</w:t>
+        <w:t xml:space="preserve">Each recommendation in the Program Growth tab has a CTA button that launches the corresponding Guided Experience directly. Customers do not need to navigate to the feature independently. The tab serves as both the discovery surface and the entry point. This closes the loop between awareness and action within a single interaction.</w:t>
       </w:r>
     </w:p>
     <w:p>
@@ -3337,7 +3337,7 @@
           <w:sz w:val="26"/>
           <w:szCs w:val="26"/>
         </w:rPr>
-        <w:t xml:space="preserve">Phase 1 — Program Growth Tab (Complete)</w:t>
+        <w:t xml:space="preserve">Phase 1: Program Growth Tab (Complete)</w:t>
       </w:r>
     </w:p>
     <w:p>
@@ -3449,7 +3449,7 @@
           <w:sz w:val="26"/>
           <w:szCs w:val="26"/>
         </w:rPr>
-        <w:t xml:space="preserve">Phase 2 — Priority Guided Experiences (Q2–Q3 2026)</w:t>
+        <w:t xml:space="preserve">Phase 2: Priority Guided Experiences (Q2–Q3 2026)</w:t>
       </w:r>
     </w:p>
     <w:p>
@@ -3501,7 +3501,7 @@
           <w:sz w:val="20"/>
           <w:szCs w:val="20"/>
         </w:rPr>
-        <w:t xml:space="preserve">Benchmark Enablement (one-click — lowest engineering complexity, high immediate impact)</w:t>
+        <w:t xml:space="preserve">Benchmark Enablement (one-click, lowest engineering complexity, high immediate impact)</w:t>
       </w:r>
     </w:p>
     <w:p>
@@ -3561,7 +3561,7 @@
           <w:sz w:val="26"/>
           <w:szCs w:val="26"/>
         </w:rPr>
-        <w:t xml:space="preserve">Phase 3 — Extended Guided Experiences (Q4 2026+)</w:t>
+        <w:t xml:space="preserve">Phase 3: Extended Guided Experiences (Q4 2026+)</w:t>
       </w:r>
     </w:p>
     <w:p>
@@ -3671,7 +3671,7 @@
           <w:sz w:val="20"/>
           <w:szCs w:val="20"/>
         </w:rPr>
-        <w:t xml:space="preserve">Metrics focus on configuration completion and value realization — not message views or feature clicks. This reflects the shift from awareness-based interventions to guided experiences that drive configured adoption.</w:t>
+        <w:t xml:space="preserve">Metrics focus on configuration completion and value realization, not message views or feature clicks. This reflects the shift from awareness-based interventions to guided experiences that drive configured adoption.</w:t>
       </w:r>
     </w:p>
     <w:p>
@@ -4728,7 +4728,7 @@
           <w:sz w:val="20"/>
           <w:szCs w:val="20"/>
         </w:rPr>
-        <w:t xml:space="preserve">Removed from the maturity framework — no current product direction.</w:t>
+        <w:t xml:space="preserve">Removed from the maturity framework. No current product direction.</w:t>
       </w:r>
     </w:p>
     <w:sectPr>
@@ -4873,7 +4873,7 @@
         <w:sz w:val="16"/>
         <w:szCs w:val="16"/>
       </w:rPr>
-      <w:t xml:space="preserve">2026 EX Maturity Strategy — Internal Draft</w:t>
+      <w:t xml:space="preserve">2026 EX Maturity Strategy | Internal Draft</w:t>
     </w:r>
   </w:p>
 </w:hdr>

</xml_diff>